<commit_message>
Added Final Project Report as Word and PDF
</commit_message>
<xml_diff>
--- a/Lesson2/Lesson2Report.docx
+++ b/Lesson2/Lesson2Report.docx
@@ -95,60 +95,28 @@
           <w:sz w:val="40"/>
           <w:szCs w:val="40"/>
         </w:rPr>
-        <w:t xml:space="preserve">Saad </w:t>
-      </w:r>
-      <w:proofErr w:type="gramStart"/>
+        <w:t>Saad W.(20233</w:t>
+      </w:r>
       <w:r>
         <w:rPr>
           <w:sz w:val="40"/>
           <w:szCs w:val="40"/>
         </w:rPr>
-        <w:t>W.(</w:t>
-      </w:r>
-      <w:proofErr w:type="gramEnd"/>
+        <w:t>7730</w:t>
+      </w:r>
       <w:r>
         <w:rPr>
           <w:sz w:val="40"/>
           <w:szCs w:val="40"/>
         </w:rPr>
-        <w:t>20233</w:t>
+        <w:t>)</w:t>
       </w:r>
       <w:r>
         <w:rPr>
           <w:sz w:val="40"/>
           <w:szCs w:val="40"/>
         </w:rPr>
-        <w:t>7730</w:t>
-      </w:r>
-      <w:r>
-        <w:rPr>
-          <w:sz w:val="40"/>
-          <w:szCs w:val="40"/>
-        </w:rPr>
-        <w:t>)</w:t>
-      </w:r>
-      <w:r>
-        <w:rPr>
-          <w:sz w:val="40"/>
-          <w:szCs w:val="40"/>
-        </w:rPr>
-        <w:t xml:space="preserve"> and Mohamed </w:t>
-      </w:r>
-      <w:proofErr w:type="gramStart"/>
-      <w:r>
-        <w:rPr>
-          <w:sz w:val="40"/>
-          <w:szCs w:val="40"/>
-        </w:rPr>
-        <w:t>K.(</w:t>
-      </w:r>
-      <w:proofErr w:type="gramEnd"/>
-      <w:r>
-        <w:rPr>
-          <w:sz w:val="40"/>
-          <w:szCs w:val="40"/>
-        </w:rPr>
-        <w:t>202338790)</w:t>
+        <w:t xml:space="preserve"> and Mohamed K.(202338790)</w:t>
       </w:r>
     </w:p>
     <w:p>
@@ -458,18 +426,8 @@
           <w:kern w:val="0"/>
           <w14:ligatures w14:val="none"/>
         </w:rPr>
-        <w:t xml:space="preserve">. The main weakness is that the backend trusts JWT payload data without properly verifying the token’s signature, leading to complete authentication bypass and user </w:t>
-      </w:r>
-      <w:proofErr w:type="gramStart"/>
-      <w:r>
-        <w:rPr>
-          <w:rFonts w:ascii="Times New Roman" w:eastAsia="Times New Roman" w:hAnsi="Times New Roman" w:cs="Times New Roman"/>
-          <w:kern w:val="0"/>
-          <w14:ligatures w14:val="none"/>
-        </w:rPr>
-        <w:t>impersonation  .</w:t>
-      </w:r>
-      <w:proofErr w:type="gramEnd"/>
+        <w:t>. The main weakness is that the backend trusts JWT payload data without properly verifying the token’s signature, leading to complete authentication bypass and user impersonation  .</w:t>
+      </w:r>
     </w:p>
     <w:p>
       <w:pPr>
@@ -480,13 +438,6 @@
           <w14:ligatures w14:val="none"/>
         </w:rPr>
       </w:pPr>
-      <w:r>
-        <w:rPr>
-          <w:rFonts w:ascii="Times New Roman" w:eastAsia="Times New Roman" w:hAnsi="Times New Roman" w:cs="Times New Roman"/>
-          <w:noProof/>
-          <w:kern w:val="0"/>
-        </w:rPr>
-      </w:r>
       <w:r>
         <w:rPr>
           <w:rFonts w:ascii="Times New Roman" w:eastAsia="Times New Roman" w:hAnsi="Times New Roman" w:cs="Times New Roman"/>
@@ -555,18 +506,8 @@
           <w:kern w:val="0"/>
           <w14:ligatures w14:val="none"/>
         </w:rPr>
-        <w:t xml:space="preserve">This vulnerability occurs because the backend decodes the JWT token but does not verify its signature before trusting the payload. A JWT consists of three parts: header, payload, and signature. The signature is meant to ensure that the token has not been modified and was issued by a trusted source. However, in this case, the application only reads the payload and directly uses fields such as username and sub for authorization decisions. Because of this, an attacker can decode the token, modify these identity fields, re-encode the payload, and send it back to the server. Since the signature is not validated, the system accepts the modified token as valid, enabling unauthorized access and user </w:t>
-      </w:r>
-      <w:proofErr w:type="gramStart"/>
-      <w:r>
-        <w:rPr>
-          <w:rFonts w:ascii="Times New Roman" w:eastAsia="Times New Roman" w:hAnsi="Times New Roman" w:cs="Times New Roman"/>
-          <w:kern w:val="0"/>
-          <w14:ligatures w14:val="none"/>
-        </w:rPr>
-        <w:t>impersonation  .</w:t>
-      </w:r>
-      <w:proofErr w:type="gramEnd"/>
+        <w:t>This vulnerability occurs because the backend decodes the JWT token but does not verify its signature before trusting the payload. A JWT consists of three parts: header, payload, and signature. The signature is meant to ensure that the token has not been modified and was issued by a trusted source. However, in this case, the application only reads the payload and directly uses fields such as username and sub for authorization decisions. Because of this, an attacker can decode the token, modify these identity fields, re-encode the payload, and send it back to the server. Since the signature is not validated, the system accepts the modified token as valid, enabling unauthorized access and user impersonation  .</w:t>
+      </w:r>
     </w:p>
     <w:p>
       <w:pPr>
@@ -577,13 +518,6 @@
           <w14:ligatures w14:val="none"/>
         </w:rPr>
       </w:pPr>
-      <w:r>
-        <w:rPr>
-          <w:rFonts w:ascii="Times New Roman" w:eastAsia="Times New Roman" w:hAnsi="Times New Roman" w:cs="Times New Roman"/>
-          <w:noProof/>
-          <w:kern w:val="0"/>
-        </w:rPr>
-      </w:r>
       <w:r>
         <w:rPr>
           <w:rFonts w:ascii="Times New Roman" w:eastAsia="Times New Roman" w:hAnsi="Times New Roman" w:cs="Times New Roman"/>
@@ -775,25 +709,7 @@
           <w:kern w:val="0"/>
           <w14:ligatures w14:val="none"/>
         </w:rPr>
-        <w:t xml:space="preserve">Browser </w:t>
-      </w:r>
-      <w:proofErr w:type="spellStart"/>
-      <w:r>
-        <w:rPr>
-          <w:rFonts w:ascii="Times New Roman" w:eastAsia="Times New Roman" w:hAnsi="Times New Roman" w:cs="Times New Roman"/>
-          <w:kern w:val="0"/>
-          <w14:ligatures w14:val="none"/>
-        </w:rPr>
-        <w:t>DevTools</w:t>
-      </w:r>
-      <w:proofErr w:type="spellEnd"/>
-      <w:r>
-        <w:rPr>
-          <w:rFonts w:ascii="Times New Roman" w:eastAsia="Times New Roman" w:hAnsi="Times New Roman" w:cs="Times New Roman"/>
-          <w:kern w:val="0"/>
-          <w14:ligatures w14:val="none"/>
-        </w:rPr>
-        <w:t xml:space="preserve"> (to capture JWT tokens)</w:t>
+        <w:t>Browser DevTools (to capture JWT tokens)</w:t>
       </w:r>
     </w:p>
     <w:p>
@@ -881,13 +797,6 @@
           <w14:ligatures w14:val="none"/>
         </w:rPr>
       </w:pPr>
-      <w:r>
-        <w:rPr>
-          <w:rFonts w:ascii="Times New Roman" w:eastAsia="Times New Roman" w:hAnsi="Times New Roman" w:cs="Times New Roman"/>
-          <w:noProof/>
-          <w:kern w:val="0"/>
-        </w:rPr>
-      </w:r>
       <w:r>
         <w:rPr>
           <w:rFonts w:ascii="Times New Roman" w:eastAsia="Times New Roman" w:hAnsi="Times New Roman" w:cs="Times New Roman"/>
@@ -965,13 +874,6 @@
           <w:noProof/>
           <w:kern w:val="0"/>
         </w:rPr>
-      </w:r>
-      <w:r>
-        <w:rPr>
-          <w:rFonts w:ascii="Times New Roman" w:eastAsia="Times New Roman" w:hAnsi="Times New Roman" w:cs="Times New Roman"/>
-          <w:noProof/>
-          <w:kern w:val="0"/>
-        </w:rPr>
         <w:pict w14:anchorId="3C03599B">
           <v:rect id="_x0000_i1028" alt="" style="width:468pt;height:.05pt;mso-width-percent:0;mso-height-percent:0;mso-width-percent:0;mso-height-percent:0" o:hralign="center" o:hrstd="t" o:hr="t" fillcolor="#a0a0a0" stroked="f"/>
         </w:pict>
@@ -1121,13 +1023,6 @@
           <w14:ligatures w14:val="none"/>
         </w:rPr>
       </w:pPr>
-      <w:r>
-        <w:rPr>
-          <w:rFonts w:ascii="Times New Roman" w:eastAsia="Times New Roman" w:hAnsi="Times New Roman" w:cs="Times New Roman"/>
-          <w:noProof/>
-          <w:kern w:val="0"/>
-        </w:rPr>
-      </w:r>
       <w:r>
         <w:rPr>
           <w:rFonts w:ascii="Times New Roman" w:eastAsia="Times New Roman" w:hAnsi="Times New Roman" w:cs="Times New Roman"/>
@@ -1205,13 +1100,6 @@
           <w:noProof/>
           <w:kern w:val="0"/>
         </w:rPr>
-      </w:r>
-      <w:r>
-        <w:rPr>
-          <w:rFonts w:ascii="Times New Roman" w:eastAsia="Times New Roman" w:hAnsi="Times New Roman" w:cs="Times New Roman"/>
-          <w:noProof/>
-          <w:kern w:val="0"/>
-        </w:rPr>
         <w:pict w14:anchorId="7CB16C6A">
           <v:rect id="_x0000_i1030" alt="" style="width:468pt;height:.05pt;mso-width-percent:0;mso-height-percent:0;mso-width-percent:0;mso-height-percent:0" o:hralign="center" o:hrstd="t" o:hr="t" fillcolor="#a0a0a0" stroked="f"/>
         </w:pict>
@@ -1244,13 +1132,6 @@
           <w14:ligatures w14:val="none"/>
         </w:rPr>
       </w:pPr>
-      <w:r>
-        <w:rPr>
-          <w:rFonts w:ascii="Times New Roman" w:eastAsia="Times New Roman" w:hAnsi="Times New Roman" w:cs="Times New Roman"/>
-          <w:noProof/>
-          <w:kern w:val="0"/>
-        </w:rPr>
-      </w:r>
       <w:r>
         <w:rPr>
           <w:rFonts w:ascii="Times New Roman" w:eastAsia="Times New Roman" w:hAnsi="Times New Roman" w:cs="Times New Roman"/>
@@ -1374,13 +1255,6 @@
           <w:noProof/>
           <w:kern w:val="0"/>
         </w:rPr>
-      </w:r>
-      <w:r>
-        <w:rPr>
-          <w:rFonts w:ascii="Times New Roman" w:eastAsia="Times New Roman" w:hAnsi="Times New Roman" w:cs="Times New Roman"/>
-          <w:noProof/>
-          <w:kern w:val="0"/>
-        </w:rPr>
         <w:pict w14:anchorId="241EC5B4">
           <v:rect id="_x0000_i1032" alt="" style="width:468pt;height:.05pt;mso-width-percent:0;mso-height-percent:0;mso-width-percent:0;mso-height-percent:0" o:hralign="center" o:hrstd="t" o:hr="t" fillcolor="#a0a0a0" stroked="f"/>
         </w:pict>
@@ -1432,13 +1306,6 @@
           <w14:ligatures w14:val="none"/>
         </w:rPr>
       </w:pPr>
-      <w:r>
-        <w:rPr>
-          <w:rFonts w:ascii="Times New Roman" w:eastAsia="Times New Roman" w:hAnsi="Times New Roman" w:cs="Times New Roman"/>
-          <w:noProof/>
-          <w:kern w:val="0"/>
-        </w:rPr>
-      </w:r>
       <w:r>
         <w:rPr>
           <w:rFonts w:ascii="Times New Roman" w:eastAsia="Times New Roman" w:hAnsi="Times New Roman" w:cs="Times New Roman"/>
@@ -1535,13 +1402,6 @@
           <w:noProof/>
           <w:kern w:val="0"/>
         </w:rPr>
-      </w:r>
-      <w:r>
-        <w:rPr>
-          <w:rFonts w:ascii="Times New Roman" w:eastAsia="Times New Roman" w:hAnsi="Times New Roman" w:cs="Times New Roman"/>
-          <w:noProof/>
-          <w:kern w:val="0"/>
-        </w:rPr>
         <w:pict w14:anchorId="77A1D34F">
           <v:rect id="_x0000_i1034" alt="" style="width:468pt;height:.05pt;mso-width-percent:0;mso-height-percent:0;mso-width-percent:0;mso-height-percent:0" o:hralign="center" o:hrstd="t" o:hr="t" fillcolor="#a0a0a0" stroked="f"/>
         </w:pict>
@@ -1613,13 +1473,6 @@
           <w:noProof/>
           <w:kern w:val="0"/>
         </w:rPr>
-      </w:r>
-      <w:r>
-        <w:rPr>
-          <w:rFonts w:ascii="Times New Roman" w:eastAsia="Times New Roman" w:hAnsi="Times New Roman" w:cs="Times New Roman"/>
-          <w:noProof/>
-          <w:kern w:val="0"/>
-        </w:rPr>
         <w:pict w14:anchorId="18BACE0A">
           <v:rect id="_x0000_i1035" alt="" style="width:468pt;height:.05pt;mso-width-percent:0;mso-height-percent:0;mso-width-percent:0;mso-height-percent:0" o:hralign="center" o:hrstd="t" o:hr="t" fillcolor="#a0a0a0" stroked="f"/>
         </w:pict>
@@ -1682,7 +1535,7 @@
           <w:kern w:val="0"/>
           <w14:ligatures w14:val="none"/>
         </w:rPr>
-        <w:t xml:space="preserve">The vulnerability is confirmed by the fact that a modified JWT payload allows access to another user’s data without requiring a valid signature. The key evidence is that the forged token, which was created without access to any secret key, is still accepted by the backend and used to authorize requests. The system returns the victim’s order list and detailed order information, even though the attacker only changed the payload fields. This demonstrates that the backend is not verifying the JWT signature and is instead trusting unvalidated user input for authentication </w:t>
+        <w:t xml:space="preserve">The vulnerability is confirmed by the fact that a modified JWT payload allows access to another user’s data without requiring a valid signature. The key evidence is that the forged token, which was created without access to any secret key, is still accepted by the backend and used to authorize requests. The system returns the victim’s order list and detailed order information, even though the attacker only changed the payload fields. This demonstrates that the backend </w:t>
       </w:r>
       <w:proofErr w:type="gramStart"/>
       <w:r>
@@ -1691,9 +1544,17 @@
           <w:kern w:val="0"/>
           <w14:ligatures w14:val="none"/>
         </w:rPr>
-        <w:t>decisions  .</w:t>
+        <w:t>is not verifying</w:t>
       </w:r>
       <w:proofErr w:type="gramEnd"/>
+      <w:r>
+        <w:rPr>
+          <w:rFonts w:ascii="Times New Roman" w:eastAsia="Times New Roman" w:hAnsi="Times New Roman" w:cs="Times New Roman"/>
+          <w:kern w:val="0"/>
+          <w14:ligatures w14:val="none"/>
+        </w:rPr>
+        <w:t xml:space="preserve"> the JWT signature and is instead trusting unvalidated user input for authentication decisions  .</w:t>
+      </w:r>
     </w:p>
     <w:p>
       <w:pPr>
@@ -1704,13 +1565,6 @@
           <w14:ligatures w14:val="none"/>
         </w:rPr>
       </w:pPr>
-      <w:r>
-        <w:rPr>
-          <w:rFonts w:ascii="Times New Roman" w:eastAsia="Times New Roman" w:hAnsi="Times New Roman" w:cs="Times New Roman"/>
-          <w:noProof/>
-          <w:kern w:val="0"/>
-        </w:rPr>
-      </w:r>
       <w:r>
         <w:rPr>
           <w:rFonts w:ascii="Times New Roman" w:eastAsia="Times New Roman" w:hAnsi="Times New Roman" w:cs="Times New Roman"/>
@@ -1826,13 +1680,6 @@
           <w:noProof/>
           <w:kern w:val="0"/>
         </w:rPr>
-      </w:r>
-      <w:r>
-        <w:rPr>
-          <w:rFonts w:ascii="Times New Roman" w:eastAsia="Times New Roman" w:hAnsi="Times New Roman" w:cs="Times New Roman"/>
-          <w:noProof/>
-          <w:kern w:val="0"/>
-        </w:rPr>
         <w:pict w14:anchorId="5683E98F">
           <v:rect id="_x0000_i1037" alt="" style="width:468pt;height:.05pt;mso-width-percent:0;mso-height-percent:0;mso-width-percent:0;mso-height-percent:0" o:hralign="center" o:hrstd="t" o:hr="t" fillcolor="#a0a0a0" stroked="f"/>
         </w:pict>
@@ -2120,36 +1967,9 @@
           <w:noProof/>
           <w:kern w:val="0"/>
         </w:rPr>
-      </w:r>
-      <w:r>
-        <w:rPr>
-          <w:rFonts w:ascii="Times New Roman" w:eastAsia="Times New Roman" w:hAnsi="Times New Roman" w:cs="Times New Roman"/>
-          <w:noProof/>
-          <w:kern w:val="0"/>
-        </w:rPr>
         <w:pict w14:anchorId="0ABA363F">
           <v:rect id="_x0000_i1038" alt="" style="width:468pt;height:.05pt;mso-width-percent:0;mso-height-percent:0;mso-width-percent:0;mso-height-percent:0" o:hralign="center" o:hrstd="t" o:hr="t" fillcolor="#a0a0a0" stroked="f"/>
         </w:pict>
-      </w:r>
-    </w:p>
-    <w:p>
-      <w:pPr>
-        <w:spacing w:before="100" w:beforeAutospacing="1" w:after="100" w:afterAutospacing="1" w:line="240" w:lineRule="auto"/>
-        <w:rPr>
-          <w:rFonts w:ascii="Times New Roman" w:eastAsia="Times New Roman" w:hAnsi="Times New Roman" w:cs="Times New Roman"/>
-          <w:kern w:val="0"/>
-          <w14:ligatures w14:val="none"/>
-        </w:rPr>
-      </w:pPr>
-      <w:r>
-        <w:rPr>
-          <w:rFonts w:ascii="Times New Roman" w:eastAsia="Times New Roman" w:hAnsi="Times New Roman" w:cs="Times New Roman"/>
-          <w:b/>
-          <w:bCs/>
-          <w:kern w:val="0"/>
-          <w14:ligatures w14:val="none"/>
-        </w:rPr>
-        <w:t>[Screenshot Placeholder 6: Code editor showing updated JWT verification logic in Lambda function]</w:t>
       </w:r>
     </w:p>
     <w:p>
@@ -2272,13 +2092,6 @@
           <w:noProof/>
           <w:kern w:val="0"/>
         </w:rPr>
-      </w:r>
-      <w:r>
-        <w:rPr>
-          <w:rFonts w:ascii="Times New Roman" w:eastAsia="Times New Roman" w:hAnsi="Times New Roman" w:cs="Times New Roman"/>
-          <w:noProof/>
-          <w:kern w:val="0"/>
-        </w:rPr>
         <w:pict w14:anchorId="32E1CB8A">
           <v:rect id="_x0000_i1039" alt="" style="width:468pt;height:.05pt;mso-width-percent:0;mso-height-percent:0;mso-width-percent:0;mso-height-percent:0" o:hralign="center" o:hrstd="t" o:hr="t" fillcolor="#a0a0a0" stroked="f"/>
         </w:pict>
@@ -2367,7 +2180,6 @@
           <w:szCs w:val="36"/>
           <w14:ligatures w14:val="none"/>
         </w:rPr>
-        <w:lastRenderedPageBreak/>
         <w:t>Verification After Fix</w:t>
       </w:r>
     </w:p>
@@ -2482,13 +2294,6 @@
           <w14:ligatures w14:val="none"/>
         </w:rPr>
       </w:pPr>
-      <w:r>
-        <w:rPr>
-          <w:rFonts w:ascii="Times New Roman" w:eastAsia="Times New Roman" w:hAnsi="Times New Roman" w:cs="Times New Roman"/>
-          <w:noProof/>
-          <w:kern w:val="0"/>
-        </w:rPr>
-      </w:r>
       <w:r>
         <w:rPr>
           <w:rFonts w:ascii="Times New Roman" w:eastAsia="Times New Roman" w:hAnsi="Times New Roman" w:cs="Times New Roman"/>
@@ -2566,13 +2371,6 @@
           <w:noProof/>
           <w:kern w:val="0"/>
         </w:rPr>
-      </w:r>
-      <w:r>
-        <w:rPr>
-          <w:rFonts w:ascii="Times New Roman" w:eastAsia="Times New Roman" w:hAnsi="Times New Roman" w:cs="Times New Roman"/>
-          <w:noProof/>
-          <w:kern w:val="0"/>
-        </w:rPr>
         <w:pict w14:anchorId="6A1D6A58">
           <v:rect id="_x0000_i1041" alt="" style="width:468pt;height:.05pt;mso-width-percent:0;mso-height-percent:0;mso-width-percent:0;mso-height-percent:0" o:hralign="center" o:hrstd="t" o:hr="t" fillcolor="#a0a0a0" stroked="f"/>
         </w:pict>
@@ -2700,7 +2498,6 @@
           <w:kern w:val="0"/>
           <w14:ligatures w14:val="none"/>
         </w:rPr>
-        <w:lastRenderedPageBreak/>
         <w:t>The main security rules are:</w:t>
       </w:r>
     </w:p>
@@ -2723,6 +2520,7 @@
           <w:kern w:val="0"/>
           <w14:ligatures w14:val="none"/>
         </w:rPr>
+        <w:lastRenderedPageBreak/>
         <w:t>The system must verify the JWT signature before trusting any identity claims</w:t>
       </w:r>
     </w:p>
@@ -2785,13 +2583,6 @@
           <w:noProof/>
           <w:kern w:val="0"/>
         </w:rPr>
-      </w:r>
-      <w:r>
-        <w:rPr>
-          <w:rFonts w:ascii="Times New Roman" w:eastAsia="Times New Roman" w:hAnsi="Times New Roman" w:cs="Times New Roman"/>
-          <w:noProof/>
-          <w:kern w:val="0"/>
-        </w:rPr>
         <w:pict w14:anchorId="3DE6C5FF">
           <v:rect id="_x0000_i1042" alt="" style="width:468pt;height:.05pt;mso-width-percent:0;mso-height-percent:0;mso-width-percent:0;mso-height-percent:0" o:hralign="center" o:hrstd="t" o:hr="t" fillcolor="#a0a0a0" stroked="f"/>
         </w:pict>
@@ -2849,25 +2640,7 @@
           <w:kern w:val="0"/>
           <w14:ligatures w14:val="none"/>
         </w:rPr>
-        <w:t xml:space="preserve">The analysis was based on multiple sources, including browser </w:t>
-      </w:r>
-      <w:proofErr w:type="spellStart"/>
-      <w:r>
-        <w:rPr>
-          <w:rFonts w:ascii="Times New Roman" w:eastAsia="Times New Roman" w:hAnsi="Times New Roman" w:cs="Times New Roman"/>
-          <w:kern w:val="0"/>
-          <w14:ligatures w14:val="none"/>
-        </w:rPr>
-        <w:t>DevTools</w:t>
-      </w:r>
-      <w:proofErr w:type="spellEnd"/>
-      <w:r>
-        <w:rPr>
-          <w:rFonts w:ascii="Times New Roman" w:eastAsia="Times New Roman" w:hAnsi="Times New Roman" w:cs="Times New Roman"/>
-          <w:kern w:val="0"/>
-          <w14:ligatures w14:val="none"/>
-        </w:rPr>
-        <w:t xml:space="preserve"> for capturing tokens, API request and response outputs, decoded JWT payloads, and terminal commands used for testing.</w:t>
+        <w:t>The analysis was based on multiple sources, including browser DevTools for capturing tokens, API request and response outputs, decoded JWT payloads, and terminal commands used for testing.</w:t>
       </w:r>
     </w:p>
     <w:p>
@@ -3042,13 +2815,6 @@
           <w:noProof/>
           <w:kern w:val="0"/>
         </w:rPr>
-      </w:r>
-      <w:r>
-        <w:rPr>
-          <w:rFonts w:ascii="Times New Roman" w:eastAsia="Times New Roman" w:hAnsi="Times New Roman" w:cs="Times New Roman"/>
-          <w:noProof/>
-          <w:kern w:val="0"/>
-        </w:rPr>
         <w:pict w14:anchorId="21CB2C93">
           <v:rect id="_x0000_i1043" alt="" style="width:468pt;height:.05pt;mso-width-percent:0;mso-height-percent:0;mso-width-percent:0;mso-height-percent:0" o:hralign="center" o:hrstd="t" o:hr="t" fillcolor="#a0a0a0" stroked="f"/>
         </w:pict>
@@ -3175,13 +2941,6 @@
           <w14:ligatures w14:val="none"/>
         </w:rPr>
       </w:pPr>
-      <w:r>
-        <w:rPr>
-          <w:rFonts w:ascii="Times New Roman" w:eastAsia="Times New Roman" w:hAnsi="Times New Roman" w:cs="Times New Roman"/>
-          <w:noProof/>
-          <w:kern w:val="0"/>
-        </w:rPr>
-      </w:r>
       <w:r>
         <w:rPr>
           <w:rFonts w:ascii="Times New Roman" w:eastAsia="Times New Roman" w:hAnsi="Times New Roman" w:cs="Times New Roman"/>
@@ -3367,78 +3126,16 @@
           <w:kern w:val="0"/>
           <w14:ligatures w14:val="none"/>
         </w:rPr>
-        <w:t>Users can no longer access other users’ data</w:t>
-      </w:r>
-    </w:p>
-    <w:p>
-      <w:pPr>
-        <w:spacing w:after="0" w:line="240" w:lineRule="auto"/>
-        <w:rPr>
-          <w:rFonts w:ascii="Times New Roman" w:eastAsia="Times New Roman" w:hAnsi="Times New Roman" w:cs="Times New Roman"/>
-          <w:kern w:val="0"/>
-          <w14:ligatures w14:val="none"/>
-        </w:rPr>
-      </w:pPr>
-    </w:p>
-    <w:p>
-      <w:pPr>
-        <w:spacing w:after="0" w:line="240" w:lineRule="auto"/>
-        <w:rPr>
-          <w:rFonts w:ascii="Times New Roman" w:eastAsia="Times New Roman" w:hAnsi="Times New Roman" w:cs="Times New Roman"/>
-          <w:kern w:val="0"/>
-          <w14:ligatures w14:val="none"/>
-        </w:rPr>
-      </w:pPr>
-    </w:p>
-    <w:p>
-      <w:pPr>
-        <w:spacing w:after="0" w:line="240" w:lineRule="auto"/>
-        <w:rPr>
-          <w:rFonts w:ascii="Times New Roman" w:eastAsia="Times New Roman" w:hAnsi="Times New Roman" w:cs="Times New Roman"/>
-          <w:kern w:val="0"/>
-          <w14:ligatures w14:val="none"/>
-        </w:rPr>
-      </w:pPr>
-    </w:p>
-    <w:p>
-      <w:pPr>
-        <w:spacing w:after="0" w:line="240" w:lineRule="auto"/>
-        <w:rPr>
-          <w:rFonts w:ascii="Times New Roman" w:eastAsia="Times New Roman" w:hAnsi="Times New Roman" w:cs="Times New Roman"/>
-          <w:kern w:val="0"/>
-          <w14:ligatures w14:val="none"/>
-        </w:rPr>
-      </w:pPr>
-    </w:p>
-    <w:p>
-      <w:pPr>
-        <w:spacing w:after="0" w:line="240" w:lineRule="auto"/>
-        <w:rPr>
-          <w:rFonts w:ascii="Times New Roman" w:eastAsia="Times New Roman" w:hAnsi="Times New Roman" w:cs="Times New Roman"/>
-          <w:kern w:val="0"/>
-          <w14:ligatures w14:val="none"/>
-        </w:rPr>
-      </w:pPr>
-    </w:p>
-    <w:p>
-      <w:pPr>
-        <w:spacing w:after="0" w:line="240" w:lineRule="auto"/>
-        <w:rPr>
-          <w:rFonts w:ascii="Times New Roman" w:eastAsia="Times New Roman" w:hAnsi="Times New Roman" w:cs="Times New Roman"/>
-          <w:kern w:val="0"/>
-          <w14:ligatures w14:val="none"/>
-        </w:rPr>
-      </w:pPr>
-    </w:p>
-    <w:p>
-      <w:pPr>
-        <w:spacing w:after="0" w:line="240" w:lineRule="auto"/>
-        <w:rPr>
-          <w:rFonts w:ascii="Times New Roman" w:eastAsia="Times New Roman" w:hAnsi="Times New Roman" w:cs="Times New Roman"/>
-          <w:kern w:val="0"/>
-          <w14:ligatures w14:val="none"/>
-        </w:rPr>
-      </w:pPr>
+        <w:t>Users can no longer access other users’ dat</w:t>
+      </w:r>
+      <w:r>
+        <w:rPr>
+          <w:rFonts w:ascii="Times New Roman" w:eastAsia="Times New Roman" w:hAnsi="Times New Roman" w:cs="Times New Roman"/>
+          <w:kern w:val="0"/>
+          <w14:ligatures w14:val="none"/>
+        </w:rPr>
+        <w:t>a</w:t>
+      </w:r>
     </w:p>
     <w:p>
       <w:pPr>
@@ -3658,25 +3355,7 @@
                 <w:kern w:val="0"/>
                 <w14:ligatures w14:val="none"/>
               </w:rPr>
-              <w:t xml:space="preserve">Browser </w:t>
-            </w:r>
-            <w:proofErr w:type="spellStart"/>
-            <w:r>
-              <w:rPr>
-                <w:rFonts w:ascii="Times New Roman" w:eastAsia="Times New Roman" w:hAnsi="Times New Roman" w:cs="Times New Roman"/>
-                <w:kern w:val="0"/>
-                <w14:ligatures w14:val="none"/>
-              </w:rPr>
-              <w:t>DevTools</w:t>
-            </w:r>
-            <w:proofErr w:type="spellEnd"/>
-            <w:r>
-              <w:rPr>
-                <w:rFonts w:ascii="Times New Roman" w:eastAsia="Times New Roman" w:hAnsi="Times New Roman" w:cs="Times New Roman"/>
-                <w:kern w:val="0"/>
-                <w14:ligatures w14:val="none"/>
-              </w:rPr>
-              <w:t>, decoded JWT payload, API requests and responses, terminal output</w:t>
+              <w:t>Browser DevTools, decoded JWT payload, API requests and responses, terminal output</w:t>
             </w:r>
           </w:p>
         </w:tc>
@@ -3746,6 +3425,46 @@
         </w:rPr>
       </w:pPr>
     </w:p>
+    <w:p>
+      <w:pPr>
+        <w:spacing w:after="0" w:line="240" w:lineRule="auto"/>
+        <w:rPr>
+          <w:rFonts w:ascii="Times New Roman" w:eastAsia="Times New Roman" w:hAnsi="Times New Roman" w:cs="Times New Roman"/>
+          <w:kern w:val="0"/>
+          <w14:ligatures w14:val="none"/>
+        </w:rPr>
+      </w:pPr>
+    </w:p>
+    <w:p>
+      <w:pPr>
+        <w:spacing w:after="0" w:line="240" w:lineRule="auto"/>
+        <w:rPr>
+          <w:rFonts w:ascii="Times New Roman" w:eastAsia="Times New Roman" w:hAnsi="Times New Roman" w:cs="Times New Roman"/>
+          <w:kern w:val="0"/>
+          <w14:ligatures w14:val="none"/>
+        </w:rPr>
+      </w:pPr>
+    </w:p>
+    <w:p>
+      <w:pPr>
+        <w:spacing w:after="0" w:line="240" w:lineRule="auto"/>
+        <w:rPr>
+          <w:rFonts w:ascii="Times New Roman" w:eastAsia="Times New Roman" w:hAnsi="Times New Roman" w:cs="Times New Roman"/>
+          <w:kern w:val="0"/>
+          <w14:ligatures w14:val="none"/>
+        </w:rPr>
+      </w:pPr>
+    </w:p>
+    <w:p>
+      <w:pPr>
+        <w:spacing w:after="0" w:line="240" w:lineRule="auto"/>
+        <w:rPr>
+          <w:rFonts w:ascii="Times New Roman" w:eastAsia="Times New Roman" w:hAnsi="Times New Roman" w:cs="Times New Roman"/>
+          <w:kern w:val="0"/>
+          <w14:ligatures w14:val="none"/>
+        </w:rPr>
+      </w:pPr>
+    </w:p>
     <w:tbl>
       <w:tblPr>
         <w:tblStyle w:val="TableGrid"/>
@@ -3779,6 +3498,7 @@
                 <w:kern w:val="0"/>
                 <w14:ligatures w14:val="none"/>
               </w:rPr>
+              <w:lastRenderedPageBreak/>
               <w:t>Vulnerability</w:t>
             </w:r>
           </w:p>

</xml_diff>